<commit_message>
docs(guides): point every lab completion guide at the pod member server
</commit_message>
<xml_diff>
--- a/docs/AC-Lab-Completion-Guide.docx
+++ b/docs/AC-Lab-Completion-Guide.docx
@@ -43,7 +43,7 @@
         <w:pStyle w:val="FirstParagraph"/>
       </w:pPr>
       <w:r>
-        <w:t xml:space="preserve">This guide provides step-by-step instructions for completing all 12 Access Control labs. Each lab presents a real-world access control problem that you must identify and fix using Active Directory Users and Computers (ADUC) on the domain controller.</w:t>
+        <w:t xml:space="preserve">This guide provides step-by-step instructions for completing all 12 Access Control labs. Each lab presents a real-world access control problem that you must identify and fix using Active Directory Users and Computers (ADUC) on your pod server.</w:t>
       </w:r>
     </w:p>
     <w:p>
@@ -328,7 +328,33 @@
         <w:t xml:space="preserve"> </w:t>
       </w:r>
       <w:r>
-        <w:t xml:space="preserve">(your instructor will provide your username and password)</w:t>
+        <w:t xml:space="preserve">— your username and lab password are shown in the portal at</w:t>
+      </w:r>
+      <w:r>
+        <w:t xml:space="preserve"> </w:t>
+      </w:r>
+      <w:hyperlink r:id="rId24">
+        <w:r>
+          <w:rPr>
+            <w:rStyle w:val="Hyperlink"/>
+          </w:rPr>
+          <w:t xml:space="preserve">https://my.digitalrcc.com</w:t>
+        </w:r>
+      </w:hyperlink>
+      <w:r>
+        <w:t xml:space="preserve"> </w:t>
+      </w:r>
+      <w:r>
+        <w:t xml:space="preserve">under</w:t>
+      </w:r>
+      <w:r>
+        <w:t xml:space="preserve"> </w:t>
+      </w:r>
+      <w:r>
+        <w:rPr>
+          <w:b/>
+        </w:rPr>
+        <w:t xml:space="preserve">Start Here → Lab Access</w:t>
       </w:r>
     </w:p>
     <w:p>
@@ -347,11 +373,11 @@
       <w:pPr>
         <w:pStyle w:val="Heading3"/>
       </w:pPr>
-      <w:bookmarkStart w:id="24" w:name="what-you-will-be-doing"/>
+      <w:bookmarkStart w:id="25" w:name="what-you-will-be-doing"/>
       <w:r>
         <w:t xml:space="preserve">What You Will Be Doing</w:t>
       </w:r>
-      <w:bookmarkEnd w:id="24"/>
+      <w:bookmarkEnd w:id="25"/>
     </w:p>
     <w:p>
       <w:pPr>
@@ -380,11 +406,11 @@
       <w:pPr>
         <w:pStyle w:val="Heading3"/>
       </w:pPr>
-      <w:bookmarkStart w:id="25" w:name="cmmc-context"/>
+      <w:bookmarkStart w:id="26" w:name="cmmc-context"/>
       <w:r>
         <w:t xml:space="preserve">CMMC Context</w:t>
       </w:r>
-      <w:bookmarkEnd w:id="25"/>
+      <w:bookmarkEnd w:id="26"/>
     </w:p>
     <w:p>
       <w:pPr>
@@ -611,11 +637,11 @@
       <w:pPr>
         <w:pStyle w:val="Heading2"/>
       </w:pPr>
-      <w:bookmarkStart w:id="26" w:name="how-to-connect-to-the-lab-environment"/>
+      <w:bookmarkStart w:id="27" w:name="how-to-connect-to-the-lab-environment"/>
       <w:r>
         <w:t xml:space="preserve">How to Connect to the Lab Environment</w:t>
       </w:r>
-      <w:bookmarkEnd w:id="26"/>
+      <w:bookmarkEnd w:id="27"/>
     </w:p>
     <w:p>
       <w:pPr>
@@ -644,11 +670,11 @@
       <w:pPr>
         <w:pStyle w:val="Heading3"/>
       </w:pPr>
-      <w:bookmarkStart w:id="27" w:name="step-1-open-the-guacamole-gateway"/>
+      <w:bookmarkStart w:id="28" w:name="step-1-open-the-guacamole-gateway"/>
       <w:r>
         <w:t xml:space="preserve">Step 1: Open the Guacamole Gateway</w:t>
       </w:r>
-      <w:bookmarkEnd w:id="27"/>
+      <w:bookmarkEnd w:id="28"/>
     </w:p>
     <w:p>
       <w:pPr>
@@ -676,7 +702,7 @@
       <w:r>
         <w:t xml:space="preserve"> </w:t>
       </w:r>
-      <w:hyperlink r:id="rId28">
+      <w:hyperlink r:id="rId29">
         <w:r>
           <w:rPr>
             <w:rStyle w:val="Hyperlink"/>
@@ -702,11 +728,11 @@
       <w:pPr>
         <w:pStyle w:val="Heading3"/>
       </w:pPr>
-      <w:bookmarkStart w:id="29" w:name="Xe90d7d5e4efae25eb475e9742c935b4a645a514"/>
+      <w:bookmarkStart w:id="30" w:name="Xe90d7d5e4efae25eb475e9742c935b4a645a514"/>
       <w:r>
         <w:t xml:space="preserve">Step 2: Log In with Your Student Credentials</w:t>
       </w:r>
-      <w:bookmarkEnd w:id="29"/>
+      <w:bookmarkEnd w:id="30"/>
     </w:p>
     <w:p>
       <w:pPr>
@@ -858,7 +884,57 @@
         <w:t xml:space="preserve"> </w:t>
       </w:r>
       <w:r>
-        <w:t xml:space="preserve">(provided by your instructor)</w:t>
+        <w:t xml:space="preserve">— sign in to the portal at</w:t>
+      </w:r>
+      <w:r>
+        <w:t xml:space="preserve"> </w:t>
+      </w:r>
+      <w:hyperlink r:id="rId24">
+        <w:r>
+          <w:rPr>
+            <w:rStyle w:val="Hyperlink"/>
+          </w:rPr>
+          <w:t xml:space="preserve">https://my.digitalrcc.com</w:t>
+        </w:r>
+      </w:hyperlink>
+      <w:r>
+        <w:t xml:space="preserve">, open</w:t>
+      </w:r>
+      <w:r>
+        <w:t xml:space="preserve"> </w:t>
+      </w:r>
+      <w:r>
+        <w:rPr>
+          <w:b/>
+        </w:rPr>
+        <w:t xml:space="preserve">Start Here</w:t>
+      </w:r>
+      <w:r>
+        <w:t xml:space="preserve">, and under</w:t>
+      </w:r>
+      <w:r>
+        <w:t xml:space="preserve"> </w:t>
+      </w:r>
+      <w:r>
+        <w:rPr>
+          <w:b/>
+        </w:rPr>
+        <w:t xml:space="preserve">Lab Access</w:t>
+      </w:r>
+      <w:r>
+        <w:t xml:space="preserve"> </w:t>
+      </w:r>
+      <w:r>
+        <w:t xml:space="preserve">click</w:t>
+      </w:r>
+      <w:r>
+        <w:t xml:space="preserve"> </w:t>
+      </w:r>
+      <w:r>
+        <w:rPr>
+          <w:b/>
+        </w:rPr>
+        <w:t xml:space="preserve">Show my lab password</w:t>
       </w:r>
     </w:p>
     <w:p>
@@ -886,11 +962,11 @@
       <w:pPr>
         <w:pStyle w:val="Heading3"/>
       </w:pPr>
-      <w:bookmarkStart w:id="30" w:name="step-3-connect-to-the-domain-controller"/>
-      <w:r>
-        <w:t xml:space="preserve">Step 3: Connect to the Domain Controller</w:t>
-      </w:r>
-      <w:bookmarkEnd w:id="30"/>
+      <w:bookmarkStart w:id="31" w:name="step-3-connect-to-your-pod-server"/>
+      <w:r>
+        <w:t xml:space="preserve">Step 3: Connect to Your Pod Server</w:t>
+      </w:r>
+      <w:bookmarkEnd w:id="31"/>
     </w:p>
     <w:p>
       <w:pPr>
@@ -958,7 +1034,7 @@
               <w:rPr>
                 <w:b/>
               </w:rPr>
-              <w:t xml:space="preserve">PODXX-DC</w:t>
+              <w:t xml:space="preserve">PODXX-SRV</w:t>
             </w:r>
           </w:p>
         </w:tc>
@@ -969,7 +1045,7 @@
               <w:jc w:val="left"/>
             </w:pPr>
             <w:r>
-              <w:t xml:space="preserve">Domain Controller — your desktop for the AC labs and every other lab family</w:t>
+              <w:t xml:space="preserve">Your pod server — your desktop for the AC labs and every other lab family</w:t>
             </w:r>
           </w:p>
         </w:tc>
@@ -980,6 +1056,56 @@
         <w:pStyle w:val="BodyText"/>
       </w:pPr>
       <w:r>
+        <w:t xml:space="preserve">This server is joined to the</w:t>
+      </w:r>
+      <w:r>
+        <w:t xml:space="preserve"> </w:t>
+      </w:r>
+      <w:r>
+        <w:rPr>
+          <w:rStyle w:val="VerbatimChar"/>
+        </w:rPr>
+        <w:t xml:space="preserve">acs-p01.local</w:t>
+      </w:r>
+      <w:r>
+        <w:t xml:space="preserve"> </w:t>
+      </w:r>
+      <w:r>
+        <w:t xml:space="preserve">domain and has the Active</w:t>
+      </w:r>
+      <w:r>
+        <w:t xml:space="preserve"> </w:t>
+      </w:r>
+      <w:r>
+        <w:t xml:space="preserve">Directory management tools installed, so you administer the directory from it.</w:t>
+      </w:r>
+      <w:r>
+        <w:t xml:space="preserve"> </w:t>
+      </w:r>
+      <w:r>
+        <w:t xml:space="preserve">You never sign in to a domain controller, and there is no</w:t>
+      </w:r>
+      <w:r>
+        <w:t xml:space="preserve"> </w:t>
+      </w:r>
+      <w:r>
+        <w:rPr>
+          <w:b/>
+        </w:rPr>
+        <w:t xml:space="preserve">PODXX-DC</w:t>
+      </w:r>
+      <w:r>
+        <w:t xml:space="preserve"> </w:t>
+      </w:r>
+      <w:r>
+        <w:t xml:space="preserve">connection.</w:t>
+      </w:r>
+    </w:p>
+    <w:p>
+      <w:pPr>
+        <w:pStyle w:val="BodyText"/>
+      </w:pPr>
+      <w:r>
         <w:t xml:space="preserve">Your pod's pfSense firewall (used in the SC labs) is not a connection here: you</w:t>
       </w:r>
       <w:r>
@@ -1022,7 +1148,7 @@
         <w:rPr>
           <w:b/>
         </w:rPr>
-        <w:t xml:space="preserve">PODXX-DC</w:t>
+        <w:t xml:space="preserve">PODXX-SRV</w:t>
       </w:r>
       <w:r>
         <w:t xml:space="preserve"> </w:t>
@@ -1037,7 +1163,7 @@
         <w:rPr>
           <w:b/>
         </w:rPr>
-        <w:t xml:space="preserve">POD03-DC</w:t>
+        <w:t xml:space="preserve">POD03-SRV</w:t>
       </w:r>
       <w:r>
         <w:t xml:space="preserve">)</w:t>
@@ -1130,11 +1256,11 @@
       <w:pPr>
         <w:pStyle w:val="Heading2"/>
       </w:pPr>
-      <w:bookmarkStart w:id="31" w:name="X0f0d92fda399a9856d4a532cda69f1bea03fc7d"/>
+      <w:bookmarkStart w:id="32" w:name="X0f0d92fda399a9856d4a532cda69f1bea03fc7d"/>
       <w:r>
         <w:t xml:space="preserve">How to Open Active Directory Users and Computers</w:t>
       </w:r>
-      <w:bookmarkEnd w:id="31"/>
+      <w:bookmarkEnd w:id="32"/>
     </w:p>
     <w:p>
       <w:pPr>
@@ -1265,7 +1391,7 @@
         <w:t xml:space="preserve"> </w:t>
       </w:r>
       <w:r>
-        <w:t xml:space="preserve">administrators of the shared domain controller, so that prompt always ends in</w:t>
+        <w:t xml:space="preserve">domain administrators, so that prompt always ends in</w:t>
       </w:r>
       <w:r>
         <w:t xml:space="preserve"> </w:t>
@@ -1338,11 +1464,11 @@
       <w:pPr>
         <w:pStyle w:val="Heading2"/>
       </w:pPr>
-      <w:bookmarkStart w:id="32" w:name="understanding-your-pod"/>
+      <w:bookmarkStart w:id="33" w:name="understanding-your-pod"/>
       <w:r>
         <w:t xml:space="preserve">Understanding Your Pod</w:t>
       </w:r>
-      <w:bookmarkEnd w:id="32"/>
+      <w:bookmarkEnd w:id="33"/>
     </w:p>
     <w:p>
       <w:pPr>
@@ -1508,11 +1634,11 @@
       <w:pPr>
         <w:pStyle w:val="Heading3"/>
       </w:pPr>
-      <w:bookmarkStart w:id="33" w:name="your-pods-folder-structure-in-aduc"/>
+      <w:bookmarkStart w:id="34" w:name="your-pods-folder-structure-in-aduc"/>
       <w:r>
         <w:t xml:space="preserve">Your Pod's Folder Structure in ADUC</w:t>
       </w:r>
-      <w:bookmarkEnd w:id="33"/>
+      <w:bookmarkEnd w:id="34"/>
     </w:p>
     <w:p>
       <w:pPr>
@@ -1717,11 +1843,11 @@
       <w:pPr>
         <w:pStyle w:val="Heading3"/>
       </w:pPr>
-      <w:bookmarkStart w:id="34" w:name="your-pods-user-accounts"/>
+      <w:bookmarkStart w:id="35" w:name="your-pods-user-accounts"/>
       <w:r>
         <w:t xml:space="preserve">Your Pod's User Accounts</w:t>
       </w:r>
-      <w:bookmarkEnd w:id="34"/>
+      <w:bookmarkEnd w:id="35"/>
     </w:p>
     <w:tbl>
       <w:tblPr>
@@ -2243,11 +2369,11 @@
       <w:pPr>
         <w:pStyle w:val="Heading2"/>
       </w:pPr>
-      <w:bookmarkStart w:id="35" w:name="module-1-account-management"/>
+      <w:bookmarkStart w:id="36" w:name="module-1-account-management"/>
       <w:r>
         <w:t xml:space="preserve">Module 1: Account Management</w:t>
       </w:r>
-      <w:bookmarkEnd w:id="35"/>
+      <w:bookmarkEnd w:id="36"/>
     </w:p>
     <w:p>
       <w:pPr>
@@ -2268,11 +2394,11 @@
       <w:pPr>
         <w:pStyle w:val="Heading3"/>
       </w:pPr>
-      <w:bookmarkStart w:id="36" w:name="X050072018cbf7e9ace72b09137320240acbfb57"/>
+      <w:bookmarkStart w:id="37" w:name="X050072018cbf7e9ace72b09137320240acbfb57"/>
       <w:r>
         <w:t xml:space="preserve">Lab L1.1 — Terminated Employee Still Has Active Access</w:t>
       </w:r>
-      <w:bookmarkEnd w:id="36"/>
+      <w:bookmarkEnd w:id="37"/>
     </w:p>
     <w:p>
       <w:pPr>
@@ -2700,11 +2826,11 @@
       <w:pPr>
         <w:pStyle w:val="Heading3"/>
       </w:pPr>
-      <w:bookmarkStart w:id="37" w:name="Xcc1ec2219b42402313862f9698ab39203437ebd"/>
+      <w:bookmarkStart w:id="38" w:name="Xcc1ec2219b42402313862f9698ab39203437ebd"/>
       <w:r>
         <w:t xml:space="preserve">Lab L1.2 — HR User Has Unauthorized Finance Access</w:t>
       </w:r>
-      <w:bookmarkEnd w:id="37"/>
+      <w:bookmarkEnd w:id="38"/>
     </w:p>
     <w:p>
       <w:pPr>
@@ -3064,11 +3190,11 @@
       <w:pPr>
         <w:pStyle w:val="Heading3"/>
       </w:pPr>
-      <w:bookmarkStart w:id="38" w:name="X343ec58d2aa01a88d12c10dfa88a3db5f967c72"/>
+      <w:bookmarkStart w:id="39" w:name="X343ec58d2aa01a88d12c10dfa88a3db5f967c72"/>
       <w:r>
         <w:t xml:space="preserve">Lab L1.3 — Helpdesk Technician Has IT-Admins Privileges</w:t>
       </w:r>
-      <w:bookmarkEnd w:id="38"/>
+      <w:bookmarkEnd w:id="39"/>
     </w:p>
     <w:p>
       <w:pPr>
@@ -3416,11 +3542,11 @@
       <w:pPr>
         <w:pStyle w:val="Heading2"/>
       </w:pPr>
-      <w:bookmarkStart w:id="39" w:name="module-2-joiners-movers-and-leavers"/>
+      <w:bookmarkStart w:id="40" w:name="module-2-joiners-movers-and-leavers"/>
       <w:r>
         <w:t xml:space="preserve">Module 2: Joiners, Movers, and Leavers</w:t>
       </w:r>
-      <w:bookmarkEnd w:id="39"/>
+      <w:bookmarkEnd w:id="40"/>
     </w:p>
     <w:p>
       <w:pPr>
@@ -3441,11 +3567,11 @@
       <w:pPr>
         <w:pStyle w:val="Heading3"/>
       </w:pPr>
-      <w:bookmarkStart w:id="40" w:name="X8911b401bccfed40cbbd38b83dea3e6d5293122"/>
+      <w:bookmarkStart w:id="41" w:name="X8911b401bccfed40cbbd38b83dea3e6d5293122"/>
       <w:r>
         <w:t xml:space="preserve">Lab L2.1 — New Hire Account Not Created (Joiner)</w:t>
       </w:r>
-      <w:bookmarkEnd w:id="40"/>
+      <w:bookmarkEnd w:id="41"/>
     </w:p>
     <w:p>
       <w:pPr>
@@ -4087,11 +4213,11 @@
       <w:pPr>
         <w:pStyle w:val="Heading3"/>
       </w:pPr>
-      <w:bookmarkStart w:id="41" w:name="X1d32dac1217e8cae6005cc7b44798734071a778"/>
+      <w:bookmarkStart w:id="42" w:name="X1d32dac1217e8cae6005cc7b44798734071a778"/>
       <w:r>
         <w:t xml:space="preserve">Lab L2.2 — Role Change Without Access Update (Mover)</w:t>
       </w:r>
-      <w:bookmarkEnd w:id="41"/>
+      <w:bookmarkEnd w:id="42"/>
     </w:p>
     <w:p>
       <w:pPr>
@@ -4436,11 +4562,11 @@
       <w:pPr>
         <w:pStyle w:val="Heading3"/>
       </w:pPr>
-      <w:bookmarkStart w:id="42" w:name="Xc57e00085172c54ca2a522727910a9aeb5a46bc"/>
+      <w:bookmarkStart w:id="43" w:name="Xc57e00085172c54ca2a522727910a9aeb5a46bc"/>
       <w:r>
         <w:t xml:space="preserve">Lab L2.3 — Departed Employee Not Properly Offboarded (Leaver)</w:t>
       </w:r>
-      <w:bookmarkEnd w:id="42"/>
+      <w:bookmarkEnd w:id="43"/>
     </w:p>
     <w:p>
       <w:pPr>
@@ -5127,11 +5253,11 @@
       <w:pPr>
         <w:pStyle w:val="Heading2"/>
       </w:pPr>
-      <w:bookmarkStart w:id="43" w:name="Xba51a337e069eb828d86a5336227531e572bc6e"/>
+      <w:bookmarkStart w:id="44" w:name="Xba51a337e069eb828d86a5336227531e572bc6e"/>
       <w:r>
         <w:t xml:space="preserve">Module 3: Least Privilege and Access Control</w:t>
       </w:r>
-      <w:bookmarkEnd w:id="43"/>
+      <w:bookmarkEnd w:id="44"/>
     </w:p>
     <w:p>
       <w:pPr>
@@ -5152,11 +5278,11 @@
       <w:pPr>
         <w:pStyle w:val="Heading3"/>
       </w:pPr>
-      <w:bookmarkStart w:id="44" w:name="Xe2e44e5f6ff18f0158add0f8587acf072c23f81"/>
+      <w:bookmarkStart w:id="45" w:name="Xe2e44e5f6ff18f0158add0f8587acf072c23f81"/>
       <w:r>
         <w:t xml:space="preserve">Lab L3.1 — User in Wrong Organizational Unit</w:t>
       </w:r>
-      <w:bookmarkEnd w:id="44"/>
+      <w:bookmarkEnd w:id="45"/>
     </w:p>
     <w:p>
       <w:pPr>
@@ -5491,11 +5617,11 @@
       <w:pPr>
         <w:pStyle w:val="Heading3"/>
       </w:pPr>
-      <w:bookmarkStart w:id="45" w:name="lab-l32--over-permissioned-group-nesting"/>
+      <w:bookmarkStart w:id="46" w:name="lab-l32--over-permissioned-group-nesting"/>
       <w:r>
         <w:t xml:space="preserve">Lab L3.2 — Over-Permissioned Group Nesting</w:t>
       </w:r>
-      <w:bookmarkEnd w:id="45"/>
+      <w:bookmarkEnd w:id="46"/>
     </w:p>
     <w:p>
       <w:pPr>
@@ -5816,11 +5942,11 @@
       <w:pPr>
         <w:pStyle w:val="Heading3"/>
       </w:pPr>
-      <w:bookmarkStart w:id="46" w:name="Xe5010747673eb4e2103e63c79009d94685a7dc9"/>
+      <w:bookmarkStart w:id="47" w:name="Xe5010747673eb4e2103e63c79009d94685a7dc9"/>
       <w:r>
         <w:t xml:space="preserve">Lab L3.3 — Delegation of Password Reset Authority</w:t>
       </w:r>
-      <w:bookmarkEnd w:id="46"/>
+      <w:bookmarkEnd w:id="47"/>
     </w:p>
     <w:p>
       <w:pPr>
@@ -6317,11 +6443,11 @@
       <w:pPr>
         <w:pStyle w:val="Heading2"/>
       </w:pPr>
-      <w:bookmarkStart w:id="47" w:name="module-4-audit-and-accountability"/>
+      <w:bookmarkStart w:id="48" w:name="module-4-audit-and-accountability"/>
       <w:r>
         <w:t xml:space="preserve">Module 4: Audit and Accountability</w:t>
       </w:r>
-      <w:bookmarkEnd w:id="47"/>
+      <w:bookmarkEnd w:id="48"/>
     </w:p>
     <w:p>
       <w:pPr>
@@ -6342,11 +6468,11 @@
       <w:pPr>
         <w:pStyle w:val="Heading3"/>
       </w:pPr>
-      <w:bookmarkStart w:id="48" w:name="Xc24d3adad6a638e93a51c32d123709dce9a7529"/>
+      <w:bookmarkStart w:id="49" w:name="Xc24d3adad6a638e93a51c32d123709dce9a7529"/>
       <w:r>
         <w:t xml:space="preserve">Lab L4.1 — Contractor Account Without Expiration</w:t>
       </w:r>
-      <w:bookmarkEnd w:id="48"/>
+      <w:bookmarkEnd w:id="49"/>
     </w:p>
     <w:p>
       <w:pPr>
@@ -6699,11 +6825,11 @@
       <w:pPr>
         <w:pStyle w:val="Heading3"/>
       </w:pPr>
-      <w:bookmarkStart w:id="49" w:name="Xe8de8949329815f5007d33e7dec3bde3cefe37b"/>
+      <w:bookmarkStart w:id="50" w:name="Xe8de8949329815f5007d33e7dec3bde3cefe37b"/>
       <w:r>
         <w:t xml:space="preserve">Lab L4.2 — Missing Audit Evidence (Empty Evidence Folder)</w:t>
       </w:r>
-      <w:bookmarkEnd w:id="49"/>
+      <w:bookmarkEnd w:id="50"/>
     </w:p>
     <w:p>
       <w:pPr>
@@ -6734,7 +6860,7 @@
         <w:t xml:space="preserve"> </w:t>
       </w:r>
       <w:r>
-        <w:t xml:space="preserve">on the domain controller. However, the folder is empty — no evidence was collected. You need to perform a basic access review and document the results.</w:t>
+        <w:t xml:space="preserve">on your pod server. However, the folder is empty — no evidence was collected. You need to perform a basic access review and document the results.</w:t>
       </w:r>
     </w:p>
     <w:p>
@@ -6788,7 +6914,7 @@
         <w:t xml:space="preserve"> </w:t>
       </w:r>
       <w:r>
-        <w:t xml:space="preserve">on the domain controller:</w:t>
+        <w:t xml:space="preserve">on your pod server:</w:t>
       </w:r>
     </w:p>
     <w:p>
@@ -7612,11 +7738,11 @@
       <w:pPr>
         <w:pStyle w:val="Heading3"/>
       </w:pPr>
-      <w:bookmarkStart w:id="50" w:name="lab-l43--incomplete-audit-evidence"/>
+      <w:bookmarkStart w:id="51" w:name="lab-l43--incomplete-audit-evidence"/>
       <w:r>
         <w:t xml:space="preserve">Lab L4.3 — Incomplete Audit Evidence</w:t>
       </w:r>
-      <w:bookmarkEnd w:id="50"/>
+      <w:bookmarkEnd w:id="51"/>
     </w:p>
     <w:p>
       <w:pPr>
@@ -8320,11 +8446,11 @@
       <w:pPr>
         <w:pStyle w:val="Heading2"/>
       </w:pPr>
-      <w:bookmarkStart w:id="51" w:name="quick-reference-where-to-find-things"/>
+      <w:bookmarkStart w:id="52" w:name="quick-reference-where-to-find-things"/>
       <w:r>
         <w:t xml:space="preserve">Quick Reference: Where to Find Things</w:t>
       </w:r>
-      <w:bookmarkEnd w:id="51"/>
+      <w:bookmarkEnd w:id="52"/>
     </w:p>
     <w:tbl>
       <w:tblPr>
@@ -8625,21 +8751,21 @@
       <w:pPr>
         <w:pStyle w:val="Heading2"/>
       </w:pPr>
-      <w:bookmarkStart w:id="52" w:name="tips-and-common-mistakes"/>
+      <w:bookmarkStart w:id="53" w:name="tips-and-common-mistakes"/>
       <w:r>
         <w:t xml:space="preserve">Tips and Common Mistakes</w:t>
       </w:r>
-      <w:bookmarkEnd w:id="52"/>
+      <w:bookmarkEnd w:id="53"/>
     </w:p>
     <w:p>
       <w:pPr>
         <w:pStyle w:val="Heading3"/>
       </w:pPr>
-      <w:bookmarkStart w:id="53" w:name="dos"/>
+      <w:bookmarkStart w:id="54" w:name="dos"/>
       <w:r>
         <w:t xml:space="preserve">Do's</w:t>
       </w:r>
-      <w:bookmarkEnd w:id="53"/>
+      <w:bookmarkEnd w:id="54"/>
     </w:p>
     <w:p>
       <w:pPr>
@@ -8750,11 +8876,11 @@
       <w:pPr>
         <w:pStyle w:val="Heading3"/>
       </w:pPr>
-      <w:bookmarkStart w:id="54" w:name="donts"/>
+      <w:bookmarkStart w:id="55" w:name="donts"/>
       <w:r>
         <w:t xml:space="preserve">Don'ts</w:t>
       </w:r>
-      <w:bookmarkEnd w:id="54"/>
+      <w:bookmarkEnd w:id="55"/>
     </w:p>
     <w:p>
       <w:pPr>
@@ -8865,11 +8991,11 @@
       <w:pPr>
         <w:pStyle w:val="Heading3"/>
       </w:pPr>
-      <w:bookmarkStart w:id="55" w:name="if-something-goes-wrong"/>
+      <w:bookmarkStart w:id="56" w:name="if-something-goes-wrong"/>
       <w:r>
         <w:t xml:space="preserve">If Something Goes Wrong</w:t>
       </w:r>
-      <w:bookmarkEnd w:id="55"/>
+      <w:bookmarkEnd w:id="56"/>
     </w:p>
     <w:p>
       <w:pPr>
@@ -9137,11 +9263,11 @@
       <w:pPr>
         <w:pStyle w:val="Heading2"/>
       </w:pPr>
-      <w:bookmarkStart w:id="56" w:name="lab-completion-checklist"/>
+      <w:bookmarkStart w:id="57" w:name="lab-completion-checklist"/>
       <w:r>
         <w:t xml:space="preserve">Lab Completion Checklist</w:t>
       </w:r>
-      <w:bookmarkEnd w:id="56"/>
+      <w:bookmarkEnd w:id="57"/>
     </w:p>
     <w:p>
       <w:pPr>

</xml_diff>